<commit_message>
Update to Beta Tester and Powerpoint 05/15/2026
</commit_message>
<xml_diff>
--- a/MODULE-10/Beta Tester Questions.docx
+++ b/MODULE-10/Beta Tester Questions.docx
@@ -124,795 +124,9 @@
           <w:sz w:val="24"/>
           <w:szCs w:val="24"/>
         </w:rPr>
-        <w:t>(Cameron M)</w:t>
-      </w:r>
-    </w:p>
-    <w:p>
-      <w:pPr>
-        <w:rPr>
-          <w:rFonts w:ascii="Times New Roman" w:hAnsi="Times New Roman" w:cs="Times New Roman"/>
-        </w:rPr>
-      </w:pPr>
-      <w:r>
-        <w:rPr>
-          <w:rFonts w:ascii="Times New Roman" w:hAnsi="Times New Roman" w:cs="Times New Roman"/>
-        </w:rPr>
-        <w:t>Test Date –</w:t>
-      </w:r>
-    </w:p>
-    <w:p>
-      <w:pPr>
-        <w:rPr>
-          <w:rFonts w:ascii="Times New Roman" w:hAnsi="Times New Roman" w:cs="Times New Roman"/>
-        </w:rPr>
-      </w:pPr>
-    </w:p>
-    <w:p>
-      <w:pPr>
-        <w:pStyle w:val="ListParagraph"/>
-        <w:numPr>
-          <w:ilvl w:val="0"/>
-          <w:numId w:val="5"/>
-        </w:numPr>
-        <w:rPr>
-          <w:rFonts w:ascii="Times New Roman" w:hAnsi="Times New Roman" w:cs="Times New Roman"/>
-        </w:rPr>
-      </w:pPr>
-      <w:r>
-        <w:rPr>
-          <w:rFonts w:ascii="Times New Roman" w:hAnsi="Times New Roman" w:cs="Times New Roman"/>
-        </w:rPr>
-        <w:t>Is the reservation process easy enough to follow without guidance?</w:t>
-      </w:r>
-    </w:p>
-    <w:p>
-      <w:pPr>
-        <w:pStyle w:val="ListParagraph"/>
-        <w:numPr>
-          <w:ilvl w:val="1"/>
-          <w:numId w:val="5"/>
-        </w:numPr>
-        <w:rPr>
-          <w:rFonts w:ascii="Times New Roman" w:hAnsi="Times New Roman" w:cs="Times New Roman"/>
-        </w:rPr>
-      </w:pPr>
-      <w:r>
-        <w:rPr>
-          <w:rFonts w:ascii="Times New Roman" w:hAnsi="Times New Roman" w:cs="Times New Roman"/>
-        </w:rPr>
-        <w:t>.</w:t>
-      </w:r>
-    </w:p>
-    <w:p>
-      <w:pPr>
-        <w:pStyle w:val="ListParagraph"/>
-        <w:ind w:left="1440"/>
-        <w:rPr>
-          <w:rFonts w:ascii="Times New Roman" w:hAnsi="Times New Roman" w:cs="Times New Roman"/>
-        </w:rPr>
-      </w:pPr>
-    </w:p>
-    <w:p>
-      <w:pPr>
-        <w:pStyle w:val="ListParagraph"/>
-        <w:numPr>
-          <w:ilvl w:val="0"/>
-          <w:numId w:val="5"/>
-        </w:numPr>
-        <w:rPr>
-          <w:rFonts w:ascii="Times New Roman" w:hAnsi="Times New Roman" w:cs="Times New Roman"/>
-        </w:rPr>
-      </w:pPr>
-      <w:r>
-        <w:rPr>
-          <w:rFonts w:ascii="Times New Roman" w:hAnsi="Times New Roman" w:cs="Times New Roman"/>
-        </w:rPr>
-        <w:t>How do you feel about the aesthetic of the site regarding what it is for? Do the colors and images flow well together? Explain.</w:t>
-      </w:r>
-    </w:p>
-    <w:p>
-      <w:pPr>
-        <w:pStyle w:val="ListParagraph"/>
-        <w:numPr>
-          <w:ilvl w:val="1"/>
-          <w:numId w:val="5"/>
-        </w:numPr>
-        <w:rPr>
-          <w:rFonts w:ascii="Times New Roman" w:hAnsi="Times New Roman" w:cs="Times New Roman"/>
-        </w:rPr>
-      </w:pPr>
-      <w:r>
-        <w:rPr>
-          <w:rFonts w:ascii="Times New Roman" w:hAnsi="Times New Roman" w:cs="Times New Roman"/>
-        </w:rPr>
-        <w:t>.</w:t>
-      </w:r>
-    </w:p>
-    <w:p>
-      <w:pPr>
-        <w:pStyle w:val="ListParagraph"/>
-        <w:ind w:left="1440"/>
-        <w:rPr>
-          <w:rFonts w:ascii="Times New Roman" w:hAnsi="Times New Roman" w:cs="Times New Roman"/>
-        </w:rPr>
-      </w:pPr>
-    </w:p>
-    <w:p>
-      <w:pPr>
-        <w:pStyle w:val="ListParagraph"/>
-        <w:numPr>
-          <w:ilvl w:val="0"/>
-          <w:numId w:val="5"/>
-        </w:numPr>
-        <w:rPr>
-          <w:rFonts w:ascii="Times New Roman" w:hAnsi="Times New Roman" w:cs="Times New Roman"/>
-        </w:rPr>
-      </w:pPr>
-      <w:r>
-        <w:rPr>
-          <w:rFonts w:ascii="Times New Roman" w:hAnsi="Times New Roman" w:cs="Times New Roman"/>
-        </w:rPr>
-        <w:t>Was it easy for you to register an account and then log in to it? Were there any features that were missing from that process?</w:t>
-      </w:r>
-    </w:p>
-    <w:p>
-      <w:pPr>
-        <w:pStyle w:val="ListParagraph"/>
-        <w:numPr>
-          <w:ilvl w:val="1"/>
-          <w:numId w:val="5"/>
-        </w:numPr>
-        <w:rPr>
-          <w:rFonts w:ascii="Times New Roman" w:hAnsi="Times New Roman" w:cs="Times New Roman"/>
-        </w:rPr>
-      </w:pPr>
-      <w:r>
-        <w:rPr>
-          <w:rFonts w:ascii="Times New Roman" w:hAnsi="Times New Roman" w:cs="Times New Roman"/>
-        </w:rPr>
-        <w:t>.</w:t>
-      </w:r>
-    </w:p>
-    <w:p>
-      <w:pPr>
-        <w:pStyle w:val="ListParagraph"/>
-        <w:ind w:left="1440"/>
-        <w:rPr>
-          <w:rFonts w:ascii="Times New Roman" w:hAnsi="Times New Roman" w:cs="Times New Roman"/>
-        </w:rPr>
-      </w:pPr>
-    </w:p>
-    <w:p>
-      <w:pPr>
-        <w:pStyle w:val="ListParagraph"/>
-        <w:numPr>
-          <w:ilvl w:val="0"/>
-          <w:numId w:val="5"/>
-        </w:numPr>
-        <w:rPr>
-          <w:rFonts w:ascii="Times New Roman" w:hAnsi="Times New Roman" w:cs="Times New Roman"/>
-        </w:rPr>
-      </w:pPr>
-      <w:r>
-        <w:rPr>
-          <w:rFonts w:ascii="Times New Roman" w:hAnsi="Times New Roman" w:cs="Times New Roman"/>
-        </w:rPr>
-        <w:t>Was the site easy to navigate?</w:t>
-      </w:r>
-    </w:p>
-    <w:p>
-      <w:pPr>
-        <w:pStyle w:val="ListParagraph"/>
-        <w:numPr>
-          <w:ilvl w:val="1"/>
-          <w:numId w:val="5"/>
-        </w:numPr>
-        <w:rPr>
-          <w:rFonts w:ascii="Times New Roman" w:hAnsi="Times New Roman" w:cs="Times New Roman"/>
-        </w:rPr>
-      </w:pPr>
-      <w:r>
-        <w:rPr>
-          <w:rFonts w:ascii="Times New Roman" w:hAnsi="Times New Roman" w:cs="Times New Roman"/>
-        </w:rPr>
-        <w:t>.</w:t>
-      </w:r>
-    </w:p>
-    <w:p>
-      <w:pPr>
-        <w:pStyle w:val="ListParagraph"/>
-        <w:ind w:left="1440"/>
-        <w:rPr>
-          <w:rFonts w:ascii="Times New Roman" w:hAnsi="Times New Roman" w:cs="Times New Roman"/>
-        </w:rPr>
-      </w:pPr>
-    </w:p>
-    <w:p>
-      <w:pPr>
-        <w:pStyle w:val="ListParagraph"/>
-        <w:numPr>
-          <w:ilvl w:val="0"/>
-          <w:numId w:val="5"/>
-        </w:numPr>
-        <w:rPr>
-          <w:rFonts w:ascii="Times New Roman" w:hAnsi="Times New Roman" w:cs="Times New Roman"/>
-        </w:rPr>
-      </w:pPr>
-      <w:r>
-        <w:rPr>
-          <w:rFonts w:ascii="Times New Roman" w:hAnsi="Times New Roman" w:cs="Times New Roman"/>
-        </w:rPr>
-        <w:t>What could be added to enhance the site?</w:t>
-      </w:r>
-    </w:p>
-    <w:p>
-      <w:pPr>
-        <w:pStyle w:val="ListParagraph"/>
-        <w:numPr>
-          <w:ilvl w:val="1"/>
-          <w:numId w:val="5"/>
-        </w:numPr>
-        <w:rPr>
-          <w:rFonts w:ascii="Times New Roman" w:hAnsi="Times New Roman" w:cs="Times New Roman"/>
-        </w:rPr>
-      </w:pPr>
-      <w:r>
-        <w:rPr>
-          <w:rFonts w:ascii="Times New Roman" w:hAnsi="Times New Roman" w:cs="Times New Roman"/>
-        </w:rPr>
-        <w:t>.</w:t>
-      </w:r>
-    </w:p>
-    <w:p>
-      <w:pPr>
-        <w:pStyle w:val="ListParagraph"/>
-        <w:ind w:left="1440"/>
-        <w:rPr>
-          <w:rFonts w:ascii="Times New Roman" w:hAnsi="Times New Roman" w:cs="Times New Roman"/>
-        </w:rPr>
-      </w:pPr>
-    </w:p>
-    <w:p>
-      <w:pPr>
-        <w:pStyle w:val="ListParagraph"/>
-        <w:numPr>
-          <w:ilvl w:val="0"/>
-          <w:numId w:val="5"/>
-        </w:numPr>
-        <w:spacing w:before="100" w:beforeAutospacing="1" w:after="100" w:afterAutospacing="1" w:line="240" w:lineRule="auto"/>
-        <w:rPr>
-          <w:rFonts w:ascii="Times New Roman" w:eastAsia="Times New Roman" w:hAnsi="Times New Roman" w:cs="Times New Roman"/>
-          <w:kern w:val="0"/>
-          <w14:ligatures w14:val="none"/>
-        </w:rPr>
-      </w:pPr>
-      <w:r>
-        <w:rPr>
-          <w:rFonts w:ascii="Times New Roman" w:eastAsia="Times New Roman" w:hAnsi="Times New Roman" w:cs="Times New Roman"/>
-          <w:kern w:val="0"/>
-          <w14:ligatures w14:val="none"/>
-        </w:rPr>
-        <w:t>Were all buttons, links, and navigation menus functioning properly throughout the website?</w:t>
-      </w:r>
-      <w:r>
-        <w:rPr>
-          <w:rFonts w:ascii="Times New Roman" w:eastAsia="Times New Roman" w:hAnsi="Times New Roman" w:cs="Times New Roman"/>
-          <w:kern w:val="0"/>
-          <w14:ligatures w14:val="none"/>
-        </w:rPr>
-        <w:br/>
-      </w:r>
-      <w:proofErr w:type="gramStart"/>
-      <w:r>
-        <w:rPr>
-          <w:rFonts w:ascii="Times New Roman" w:eastAsia="Times New Roman" w:hAnsi="Times New Roman" w:cs="Times New Roman"/>
-          <w:kern w:val="0"/>
-          <w14:ligatures w14:val="none"/>
-        </w:rPr>
-        <w:t>a. .</w:t>
-      </w:r>
-      <w:proofErr w:type="gramEnd"/>
-      <w:r>
-        <w:rPr>
-          <w:rFonts w:ascii="Times New Roman" w:eastAsia="Times New Roman" w:hAnsi="Times New Roman" w:cs="Times New Roman"/>
-          <w:kern w:val="0"/>
-          <w14:ligatures w14:val="none"/>
-        </w:rPr>
-        <w:t xml:space="preserve"> </w:t>
-      </w:r>
-    </w:p>
-    <w:p>
-      <w:pPr>
-        <w:pStyle w:val="ListParagraph"/>
-        <w:spacing w:before="100" w:beforeAutospacing="1" w:after="100" w:afterAutospacing="1" w:line="240" w:lineRule="auto"/>
-        <w:rPr>
-          <w:rFonts w:ascii="Times New Roman" w:eastAsia="Times New Roman" w:hAnsi="Times New Roman" w:cs="Times New Roman"/>
-          <w:kern w:val="0"/>
-          <w14:ligatures w14:val="none"/>
-        </w:rPr>
-      </w:pPr>
-    </w:p>
-    <w:p>
-      <w:pPr>
-        <w:pStyle w:val="ListParagraph"/>
-        <w:numPr>
-          <w:ilvl w:val="0"/>
-          <w:numId w:val="5"/>
-        </w:numPr>
-        <w:spacing w:before="100" w:beforeAutospacing="1" w:after="100" w:afterAutospacing="1" w:line="240" w:lineRule="auto"/>
-        <w:rPr>
-          <w:rFonts w:ascii="Times New Roman" w:eastAsia="Times New Roman" w:hAnsi="Times New Roman" w:cs="Times New Roman"/>
-          <w:kern w:val="0"/>
-          <w14:ligatures w14:val="none"/>
-        </w:rPr>
-      </w:pPr>
-      <w:r>
-        <w:rPr>
-          <w:rFonts w:ascii="Times New Roman" w:eastAsia="Times New Roman" w:hAnsi="Times New Roman" w:cs="Times New Roman"/>
-          <w:kern w:val="0"/>
-          <w14:ligatures w14:val="none"/>
-        </w:rPr>
-        <w:t>Did the website pages load in a reasonable amount of time on your device? Explain if any pages seemed slow.</w:t>
-      </w:r>
-      <w:r>
-        <w:rPr>
-          <w:rFonts w:ascii="Times New Roman" w:eastAsia="Times New Roman" w:hAnsi="Times New Roman" w:cs="Times New Roman"/>
-          <w:kern w:val="0"/>
-          <w14:ligatures w14:val="none"/>
-        </w:rPr>
-        <w:br/>
-      </w:r>
-      <w:proofErr w:type="gramStart"/>
-      <w:r>
-        <w:rPr>
-          <w:rFonts w:ascii="Times New Roman" w:eastAsia="Times New Roman" w:hAnsi="Times New Roman" w:cs="Times New Roman"/>
-          <w:kern w:val="0"/>
-          <w14:ligatures w14:val="none"/>
-        </w:rPr>
-        <w:t>a. .</w:t>
-      </w:r>
-      <w:proofErr w:type="gramEnd"/>
-      <w:r>
-        <w:rPr>
-          <w:rFonts w:ascii="Times New Roman" w:eastAsia="Times New Roman" w:hAnsi="Times New Roman" w:cs="Times New Roman"/>
-          <w:kern w:val="0"/>
-          <w14:ligatures w14:val="none"/>
-        </w:rPr>
-        <w:t xml:space="preserve"> </w:t>
-      </w:r>
-    </w:p>
-    <w:p>
-      <w:pPr>
-        <w:pStyle w:val="ListParagraph"/>
-        <w:rPr>
-          <w:rFonts w:ascii="Times New Roman" w:eastAsia="Times New Roman" w:hAnsi="Times New Roman" w:cs="Times New Roman"/>
-          <w:kern w:val="0"/>
-          <w14:ligatures w14:val="none"/>
-        </w:rPr>
-      </w:pPr>
-    </w:p>
-    <w:p>
-      <w:pPr>
-        <w:pStyle w:val="ListParagraph"/>
-        <w:spacing w:before="100" w:beforeAutospacing="1" w:after="100" w:afterAutospacing="1" w:line="240" w:lineRule="auto"/>
-        <w:rPr>
-          <w:rFonts w:ascii="Times New Roman" w:eastAsia="Times New Roman" w:hAnsi="Times New Roman" w:cs="Times New Roman"/>
-          <w:kern w:val="0"/>
-          <w14:ligatures w14:val="none"/>
-        </w:rPr>
-      </w:pPr>
-    </w:p>
-    <w:p>
-      <w:pPr>
-        <w:pStyle w:val="ListParagraph"/>
-        <w:numPr>
-          <w:ilvl w:val="0"/>
-          <w:numId w:val="5"/>
-        </w:numPr>
-        <w:spacing w:before="100" w:beforeAutospacing="1" w:after="100" w:afterAutospacing="1" w:line="240" w:lineRule="auto"/>
-        <w:rPr>
-          <w:rFonts w:ascii="Times New Roman" w:eastAsia="Times New Roman" w:hAnsi="Times New Roman" w:cs="Times New Roman"/>
-          <w:kern w:val="0"/>
-          <w14:ligatures w14:val="none"/>
-        </w:rPr>
-      </w:pPr>
-      <w:r>
-        <w:rPr>
-          <w:rFonts w:ascii="Times New Roman" w:eastAsia="Times New Roman" w:hAnsi="Times New Roman" w:cs="Times New Roman"/>
-          <w:kern w:val="0"/>
-          <w14:ligatures w14:val="none"/>
-        </w:rPr>
-        <w:t>Was the information on the website clear and easy to understand, including reservation details and pricing?</w:t>
-      </w:r>
-      <w:r>
-        <w:rPr>
-          <w:rFonts w:ascii="Times New Roman" w:eastAsia="Times New Roman" w:hAnsi="Times New Roman" w:cs="Times New Roman"/>
-          <w:kern w:val="0"/>
-          <w14:ligatures w14:val="none"/>
-        </w:rPr>
-        <w:br/>
-      </w:r>
-      <w:proofErr w:type="gramStart"/>
-      <w:r>
-        <w:rPr>
-          <w:rFonts w:ascii="Times New Roman" w:eastAsia="Times New Roman" w:hAnsi="Times New Roman" w:cs="Times New Roman"/>
-          <w:kern w:val="0"/>
-          <w14:ligatures w14:val="none"/>
-        </w:rPr>
-        <w:t>a. .</w:t>
-      </w:r>
-      <w:proofErr w:type="gramEnd"/>
-      <w:r>
-        <w:rPr>
-          <w:rFonts w:ascii="Times New Roman" w:eastAsia="Times New Roman" w:hAnsi="Times New Roman" w:cs="Times New Roman"/>
-          <w:kern w:val="0"/>
-          <w14:ligatures w14:val="none"/>
-        </w:rPr>
-        <w:t xml:space="preserve"> </w:t>
-      </w:r>
-    </w:p>
-    <w:p>
-      <w:pPr>
-        <w:pStyle w:val="ListParagraph"/>
-        <w:spacing w:before="100" w:beforeAutospacing="1" w:after="100" w:afterAutospacing="1" w:line="240" w:lineRule="auto"/>
-        <w:rPr>
-          <w:rFonts w:ascii="Times New Roman" w:eastAsia="Times New Roman" w:hAnsi="Times New Roman" w:cs="Times New Roman"/>
-          <w:kern w:val="0"/>
-          <w14:ligatures w14:val="none"/>
-        </w:rPr>
-      </w:pPr>
-    </w:p>
-    <w:p>
-      <w:pPr>
-        <w:pStyle w:val="ListParagraph"/>
-        <w:numPr>
-          <w:ilvl w:val="0"/>
-          <w:numId w:val="5"/>
-        </w:numPr>
-        <w:spacing w:before="100" w:beforeAutospacing="1" w:after="100" w:afterAutospacing="1" w:line="240" w:lineRule="auto"/>
-        <w:rPr>
-          <w:rFonts w:ascii="Times New Roman" w:eastAsia="Times New Roman" w:hAnsi="Times New Roman" w:cs="Times New Roman"/>
-          <w:kern w:val="0"/>
-          <w14:ligatures w14:val="none"/>
-        </w:rPr>
-      </w:pPr>
-      <w:r>
-        <w:rPr>
-          <w:rFonts w:ascii="Times New Roman" w:eastAsia="Times New Roman" w:hAnsi="Times New Roman" w:cs="Times New Roman"/>
-          <w:kern w:val="0"/>
-          <w14:ligatures w14:val="none"/>
-        </w:rPr>
-        <w:t>Did the website make you feel confident and comfortable booking a reservation online? Why or why not?</w:t>
-      </w:r>
-      <w:r>
-        <w:rPr>
-          <w:rFonts w:ascii="Times New Roman" w:eastAsia="Times New Roman" w:hAnsi="Times New Roman" w:cs="Times New Roman"/>
-          <w:kern w:val="0"/>
-          <w14:ligatures w14:val="none"/>
-        </w:rPr>
-        <w:br/>
-      </w:r>
-      <w:proofErr w:type="gramStart"/>
-      <w:r>
-        <w:rPr>
-          <w:rFonts w:ascii="Times New Roman" w:eastAsia="Times New Roman" w:hAnsi="Times New Roman" w:cs="Times New Roman"/>
-          <w:kern w:val="0"/>
-          <w14:ligatures w14:val="none"/>
-        </w:rPr>
-        <w:t>a. .</w:t>
-      </w:r>
-      <w:proofErr w:type="gramEnd"/>
-      <w:r>
-        <w:rPr>
-          <w:rFonts w:ascii="Times New Roman" w:eastAsia="Times New Roman" w:hAnsi="Times New Roman" w:cs="Times New Roman"/>
-          <w:kern w:val="0"/>
-          <w14:ligatures w14:val="none"/>
-        </w:rPr>
-        <w:t xml:space="preserve"> </w:t>
-      </w:r>
-    </w:p>
-    <w:p>
-      <w:pPr>
-        <w:pStyle w:val="ListParagraph"/>
-        <w:rPr>
-          <w:rFonts w:ascii="Times New Roman" w:eastAsia="Times New Roman" w:hAnsi="Times New Roman" w:cs="Times New Roman"/>
-          <w:kern w:val="0"/>
-          <w14:ligatures w14:val="none"/>
-        </w:rPr>
-      </w:pPr>
-    </w:p>
-    <w:p>
-      <w:pPr>
-        <w:pStyle w:val="ListParagraph"/>
-        <w:spacing w:before="100" w:beforeAutospacing="1" w:after="100" w:afterAutospacing="1" w:line="240" w:lineRule="auto"/>
-        <w:rPr>
-          <w:rFonts w:ascii="Times New Roman" w:eastAsia="Times New Roman" w:hAnsi="Times New Roman" w:cs="Times New Roman"/>
-          <w:kern w:val="0"/>
-          <w14:ligatures w14:val="none"/>
-        </w:rPr>
-      </w:pPr>
-    </w:p>
-    <w:p>
-      <w:pPr>
-        <w:pStyle w:val="ListParagraph"/>
-        <w:numPr>
-          <w:ilvl w:val="0"/>
-          <w:numId w:val="5"/>
-        </w:numPr>
-        <w:spacing w:before="100" w:beforeAutospacing="1" w:after="100" w:afterAutospacing="1" w:line="240" w:lineRule="auto"/>
-        <w:rPr>
-          <w:rFonts w:ascii="Times New Roman" w:eastAsia="Times New Roman" w:hAnsi="Times New Roman" w:cs="Times New Roman"/>
-          <w:kern w:val="0"/>
-          <w14:ligatures w14:val="none"/>
-        </w:rPr>
-      </w:pPr>
-      <w:r>
-        <w:rPr>
-          <w:rFonts w:ascii="Times New Roman" w:eastAsia="Times New Roman" w:hAnsi="Times New Roman" w:cs="Times New Roman"/>
-          <w:kern w:val="0"/>
-          <w14:ligatures w14:val="none"/>
-        </w:rPr>
-        <w:t>Was the layout of the website consistent across all pages, and did it help improve your overall experience?</w:t>
-      </w:r>
-      <w:r>
-        <w:rPr>
-          <w:rFonts w:ascii="Times New Roman" w:eastAsia="Times New Roman" w:hAnsi="Times New Roman" w:cs="Times New Roman"/>
-          <w:kern w:val="0"/>
-          <w14:ligatures w14:val="none"/>
-        </w:rPr>
-        <w:br/>
-      </w:r>
-      <w:proofErr w:type="gramStart"/>
-      <w:r>
-        <w:rPr>
-          <w:rFonts w:ascii="Times New Roman" w:eastAsia="Times New Roman" w:hAnsi="Times New Roman" w:cs="Times New Roman"/>
-          <w:kern w:val="0"/>
-          <w14:ligatures w14:val="none"/>
-        </w:rPr>
-        <w:t>a. .</w:t>
-      </w:r>
-      <w:proofErr w:type="gramEnd"/>
-    </w:p>
-    <w:p>
-      <w:pPr>
-        <w:numPr>
-          <w:ilvl w:val="0"/>
-          <w:numId w:val="5"/>
-        </w:numPr>
-        <w:spacing w:before="100" w:beforeAutospacing="1" w:after="100" w:afterAutospacing="1" w:line="240" w:lineRule="auto"/>
-        <w:rPr>
-          <w:rFonts w:ascii="Times New Roman" w:eastAsia="Times New Roman" w:hAnsi="Times New Roman" w:cs="Times New Roman"/>
-          <w:kern w:val="0"/>
-          <w14:ligatures w14:val="none"/>
-        </w:rPr>
-      </w:pPr>
-      <w:r>
-        <w:rPr>
-          <w:rFonts w:ascii="Times New Roman" w:eastAsia="Times New Roman" w:hAnsi="Times New Roman" w:cs="Times New Roman"/>
-          <w:kern w:val="0"/>
-          <w14:ligatures w14:val="none"/>
-        </w:rPr>
-        <w:t>Did you experience any errors, broken pages, or unexpected behavior while using the website? If so, explain.</w:t>
-      </w:r>
-      <w:r>
-        <w:rPr>
-          <w:rFonts w:ascii="Times New Roman" w:eastAsia="Times New Roman" w:hAnsi="Times New Roman" w:cs="Times New Roman"/>
-          <w:kern w:val="0"/>
-          <w14:ligatures w14:val="none"/>
-        </w:rPr>
-        <w:br/>
-      </w:r>
-      <w:proofErr w:type="gramStart"/>
-      <w:r>
-        <w:rPr>
-          <w:rFonts w:ascii="Times New Roman" w:eastAsia="Times New Roman" w:hAnsi="Times New Roman" w:cs="Times New Roman"/>
-          <w:kern w:val="0"/>
-          <w14:ligatures w14:val="none"/>
-        </w:rPr>
-        <w:t>a. .</w:t>
-      </w:r>
-      <w:proofErr w:type="gramEnd"/>
-      <w:r>
-        <w:rPr>
-          <w:rFonts w:ascii="Times New Roman" w:eastAsia="Times New Roman" w:hAnsi="Times New Roman" w:cs="Times New Roman"/>
-          <w:kern w:val="0"/>
-          <w14:ligatures w14:val="none"/>
-        </w:rPr>
-        <w:t xml:space="preserve"> </w:t>
-      </w:r>
-    </w:p>
-    <w:p>
-      <w:pPr>
-        <w:numPr>
-          <w:ilvl w:val="0"/>
-          <w:numId w:val="5"/>
-        </w:numPr>
-        <w:spacing w:before="100" w:beforeAutospacing="1" w:after="100" w:afterAutospacing="1" w:line="240" w:lineRule="auto"/>
-        <w:rPr>
-          <w:rFonts w:ascii="Times New Roman" w:eastAsia="Times New Roman" w:hAnsi="Times New Roman" w:cs="Times New Roman"/>
-          <w:kern w:val="0"/>
-          <w14:ligatures w14:val="none"/>
-        </w:rPr>
-      </w:pPr>
-      <w:r>
-        <w:rPr>
-          <w:rFonts w:ascii="Times New Roman" w:eastAsia="Times New Roman" w:hAnsi="Times New Roman" w:cs="Times New Roman"/>
-          <w:kern w:val="0"/>
-          <w14:ligatures w14:val="none"/>
-        </w:rPr>
-        <w:t>Did the reservation confirmation and account features provide enough feedback and information after completing actions?</w:t>
-      </w:r>
-      <w:r>
-        <w:rPr>
-          <w:rFonts w:ascii="Times New Roman" w:eastAsia="Times New Roman" w:hAnsi="Times New Roman" w:cs="Times New Roman"/>
-          <w:kern w:val="0"/>
-          <w14:ligatures w14:val="none"/>
-        </w:rPr>
-        <w:br/>
-      </w:r>
-      <w:proofErr w:type="gramStart"/>
-      <w:r>
-        <w:rPr>
-          <w:rFonts w:ascii="Times New Roman" w:eastAsia="Times New Roman" w:hAnsi="Times New Roman" w:cs="Times New Roman"/>
-          <w:kern w:val="0"/>
-          <w14:ligatures w14:val="none"/>
-        </w:rPr>
-        <w:t>a. .</w:t>
-      </w:r>
-      <w:proofErr w:type="gramEnd"/>
-      <w:r>
-        <w:rPr>
-          <w:rFonts w:ascii="Times New Roman" w:eastAsia="Times New Roman" w:hAnsi="Times New Roman" w:cs="Times New Roman"/>
-          <w:kern w:val="0"/>
-          <w14:ligatures w14:val="none"/>
-        </w:rPr>
-        <w:t xml:space="preserve"> </w:t>
-      </w:r>
-    </w:p>
-    <w:p>
-      <w:pPr>
-        <w:numPr>
-          <w:ilvl w:val="0"/>
-          <w:numId w:val="5"/>
-        </w:numPr>
-        <w:spacing w:before="100" w:beforeAutospacing="1" w:after="100" w:afterAutospacing="1" w:line="240" w:lineRule="auto"/>
-        <w:rPr>
-          <w:rFonts w:ascii="Times New Roman" w:eastAsia="Times New Roman" w:hAnsi="Times New Roman" w:cs="Times New Roman"/>
-          <w:kern w:val="0"/>
-          <w14:ligatures w14:val="none"/>
-        </w:rPr>
-      </w:pPr>
-      <w:r>
-        <w:rPr>
-          <w:rFonts w:ascii="Times New Roman" w:eastAsia="Times New Roman" w:hAnsi="Times New Roman" w:cs="Times New Roman"/>
-          <w:kern w:val="0"/>
-          <w14:ligatures w14:val="none"/>
-        </w:rPr>
-        <w:t>Were the fonts, text sizes, and overall readability comfortable throughout the website?</w:t>
-      </w:r>
-      <w:r>
-        <w:rPr>
-          <w:rFonts w:ascii="Times New Roman" w:eastAsia="Times New Roman" w:hAnsi="Times New Roman" w:cs="Times New Roman"/>
-          <w:kern w:val="0"/>
-          <w14:ligatures w14:val="none"/>
-        </w:rPr>
-        <w:br/>
-      </w:r>
-      <w:proofErr w:type="gramStart"/>
-      <w:r>
-        <w:rPr>
-          <w:rFonts w:ascii="Times New Roman" w:eastAsia="Times New Roman" w:hAnsi="Times New Roman" w:cs="Times New Roman"/>
-          <w:kern w:val="0"/>
-          <w14:ligatures w14:val="none"/>
-        </w:rPr>
-        <w:t>a. .</w:t>
-      </w:r>
-      <w:proofErr w:type="gramEnd"/>
-      <w:r>
-        <w:rPr>
-          <w:rFonts w:ascii="Times New Roman" w:eastAsia="Times New Roman" w:hAnsi="Times New Roman" w:cs="Times New Roman"/>
-          <w:kern w:val="0"/>
-          <w14:ligatures w14:val="none"/>
-        </w:rPr>
-        <w:t xml:space="preserve"> </w:t>
-      </w:r>
-    </w:p>
-    <w:p>
-      <w:pPr>
-        <w:numPr>
-          <w:ilvl w:val="0"/>
-          <w:numId w:val="5"/>
-        </w:numPr>
-        <w:spacing w:before="100" w:beforeAutospacing="1" w:after="100" w:afterAutospacing="1" w:line="240" w:lineRule="auto"/>
-        <w:rPr>
-          <w:rFonts w:ascii="Times New Roman" w:eastAsia="Times New Roman" w:hAnsi="Times New Roman" w:cs="Times New Roman"/>
-          <w:kern w:val="0"/>
-          <w14:ligatures w14:val="none"/>
-        </w:rPr>
-      </w:pPr>
-      <w:r>
-        <w:rPr>
-          <w:rFonts w:ascii="Times New Roman" w:eastAsia="Times New Roman" w:hAnsi="Times New Roman" w:cs="Times New Roman"/>
-          <w:kern w:val="0"/>
-          <w14:ligatures w14:val="none"/>
-        </w:rPr>
-        <w:t>If you were planning a real vacation, would you personally use this website to book a stay at Moffat Bay Lodge? Why or why not?</w:t>
-      </w:r>
-      <w:r>
-        <w:rPr>
-          <w:rFonts w:ascii="Times New Roman" w:eastAsia="Times New Roman" w:hAnsi="Times New Roman" w:cs="Times New Roman"/>
-          <w:kern w:val="0"/>
-          <w14:ligatures w14:val="none"/>
-        </w:rPr>
-        <w:br/>
-      </w:r>
-      <w:proofErr w:type="gramStart"/>
-      <w:r>
-        <w:rPr>
-          <w:rFonts w:ascii="Times New Roman" w:eastAsia="Times New Roman" w:hAnsi="Times New Roman" w:cs="Times New Roman"/>
-          <w:kern w:val="0"/>
-          <w14:ligatures w14:val="none"/>
-        </w:rPr>
-        <w:t>a. .</w:t>
-      </w:r>
-      <w:proofErr w:type="gramEnd"/>
-    </w:p>
-    <w:p>
-      <w:pPr>
-        <w:numPr>
-          <w:ilvl w:val="0"/>
-          <w:numId w:val="5"/>
-        </w:numPr>
-        <w:spacing w:before="100" w:beforeAutospacing="1" w:after="100" w:afterAutospacing="1" w:line="240" w:lineRule="auto"/>
-        <w:rPr>
-          <w:rFonts w:ascii="Times New Roman" w:eastAsia="Times New Roman" w:hAnsi="Times New Roman" w:cs="Times New Roman"/>
-          <w:kern w:val="0"/>
-          <w14:ligatures w14:val="none"/>
-        </w:rPr>
-      </w:pPr>
-      <w:r>
-        <w:rPr>
-          <w:rFonts w:ascii="Times New Roman" w:eastAsia="Times New Roman" w:hAnsi="Times New Roman" w:cs="Times New Roman"/>
-          <w:kern w:val="0"/>
-          <w14:ligatures w14:val="none"/>
-        </w:rPr>
-        <w:t>If you were planning a real vacation, would you personally use this website to book a stay at Moffat Bay Lodge? Why or why not?</w:t>
-      </w:r>
-    </w:p>
-    <w:p>
-      <w:pPr>
-        <w:numPr>
-          <w:ilvl w:val="0"/>
-          <w:numId w:val="5"/>
-        </w:numPr>
-        <w:spacing w:before="100" w:beforeAutospacing="1" w:after="100" w:afterAutospacing="1" w:line="240" w:lineRule="auto"/>
-        <w:rPr>
-          <w:rFonts w:ascii="Times New Roman" w:eastAsia="Times New Roman" w:hAnsi="Times New Roman" w:cs="Times New Roman"/>
-          <w:kern w:val="0"/>
-          <w14:ligatures w14:val="none"/>
-        </w:rPr>
-      </w:pPr>
-      <w:proofErr w:type="gramStart"/>
-      <w:r>
-        <w:rPr>
-          <w:rFonts w:ascii="Times New Roman" w:eastAsia="Times New Roman" w:hAnsi="Times New Roman" w:cs="Times New Roman"/>
-          <w:kern w:val="0"/>
-          <w14:ligatures w14:val="none"/>
-        </w:rPr>
-        <w:t>a. .</w:t>
-      </w:r>
-      <w:proofErr w:type="gramEnd"/>
-    </w:p>
-    <w:p>
-      <w:pPr>
-        <w:rPr>
-          <w:rFonts w:ascii="Times New Roman" w:hAnsi="Times New Roman" w:cs="Times New Roman"/>
-        </w:rPr>
-      </w:pPr>
-    </w:p>
-    <w:p>
-      <w:pPr>
-        <w:pStyle w:val="Heading1"/>
+        <w:t xml:space="preserve">Alexandra M </w:t>
+      </w:r>
+      <w:r>
         <w:rPr>
           <w:rFonts w:ascii="Times New Roman" w:hAnsi="Times New Roman" w:cs="Times New Roman"/>
           <w:b/>
@@ -921,8 +135,764 @@
           <w:sz w:val="24"/>
           <w:szCs w:val="24"/>
         </w:rPr>
-      </w:pPr>
-      <w:r>
+        <w:t>(Cameron M)</w:t>
+      </w:r>
+    </w:p>
+    <w:p>
+      <w:pPr>
+        <w:rPr>
+          <w:rFonts w:ascii="Times New Roman" w:hAnsi="Times New Roman" w:cs="Times New Roman"/>
+        </w:rPr>
+      </w:pPr>
+      <w:r>
+        <w:rPr>
+          <w:rFonts w:ascii="Times New Roman" w:hAnsi="Times New Roman" w:cs="Times New Roman"/>
+        </w:rPr>
+        <w:t>Test Date –</w:t>
+      </w:r>
+      <w:r>
+        <w:rPr>
+          <w:rFonts w:ascii="Times New Roman" w:hAnsi="Times New Roman" w:cs="Times New Roman"/>
+        </w:rPr>
+        <w:t xml:space="preserve"> 05.15.2026</w:t>
+      </w:r>
+    </w:p>
+    <w:p>
+      <w:pPr>
+        <w:rPr>
+          <w:rFonts w:ascii="Times New Roman" w:hAnsi="Times New Roman" w:cs="Times New Roman"/>
+        </w:rPr>
+      </w:pPr>
+    </w:p>
+    <w:p>
+      <w:pPr>
+        <w:pStyle w:val="ListParagraph"/>
+        <w:numPr>
+          <w:ilvl w:val="0"/>
+          <w:numId w:val="5"/>
+        </w:numPr>
+        <w:rPr>
+          <w:rFonts w:ascii="Times New Roman" w:hAnsi="Times New Roman" w:cs="Times New Roman"/>
+        </w:rPr>
+      </w:pPr>
+      <w:r>
+        <w:rPr>
+          <w:rFonts w:ascii="Times New Roman" w:hAnsi="Times New Roman" w:cs="Times New Roman"/>
+        </w:rPr>
+        <w:t>Is the reservation process easy enough to follow without guidance?</w:t>
+      </w:r>
+    </w:p>
+    <w:p>
+      <w:pPr>
+        <w:pStyle w:val="ListParagraph"/>
+        <w:numPr>
+          <w:ilvl w:val="1"/>
+          <w:numId w:val="5"/>
+        </w:numPr>
+        <w:rPr>
+          <w:rFonts w:ascii="Times New Roman" w:hAnsi="Times New Roman" w:cs="Times New Roman"/>
+        </w:rPr>
+      </w:pPr>
+      <w:r>
+        <w:rPr>
+          <w:rFonts w:ascii="Times New Roman" w:hAnsi="Times New Roman" w:cs="Times New Roman"/>
+        </w:rPr>
+        <w:t>Very much so!</w:t>
+      </w:r>
+    </w:p>
+    <w:p>
+      <w:pPr>
+        <w:pStyle w:val="ListParagraph"/>
+        <w:ind w:left="1440"/>
+        <w:rPr>
+          <w:rFonts w:ascii="Times New Roman" w:hAnsi="Times New Roman" w:cs="Times New Roman"/>
+        </w:rPr>
+      </w:pPr>
+    </w:p>
+    <w:p>
+      <w:pPr>
+        <w:pStyle w:val="ListParagraph"/>
+        <w:numPr>
+          <w:ilvl w:val="0"/>
+          <w:numId w:val="5"/>
+        </w:numPr>
+        <w:rPr>
+          <w:rFonts w:ascii="Times New Roman" w:hAnsi="Times New Roman" w:cs="Times New Roman"/>
+        </w:rPr>
+      </w:pPr>
+      <w:r>
+        <w:rPr>
+          <w:rFonts w:ascii="Times New Roman" w:hAnsi="Times New Roman" w:cs="Times New Roman"/>
+        </w:rPr>
+        <w:t>How do you feel about the aesthetic of the site regarding what it is for? Do the colors and images flow well together? Explain.</w:t>
+      </w:r>
+    </w:p>
+    <w:p>
+      <w:pPr>
+        <w:pStyle w:val="ListParagraph"/>
+        <w:numPr>
+          <w:ilvl w:val="1"/>
+          <w:numId w:val="5"/>
+        </w:numPr>
+        <w:rPr>
+          <w:rFonts w:ascii="Times New Roman" w:hAnsi="Times New Roman" w:cs="Times New Roman"/>
+        </w:rPr>
+      </w:pPr>
+      <w:r>
+        <w:rPr>
+          <w:rFonts w:ascii="Times New Roman" w:hAnsi="Times New Roman" w:cs="Times New Roman"/>
+        </w:rPr>
+        <w:t xml:space="preserve">Yes, the site has a nice aesthetic and I think the color scheme fits well for the area of the venue. It was either going to that soft shades of green or blue that fit well for this one. </w:t>
+      </w:r>
+    </w:p>
+    <w:p>
+      <w:pPr>
+        <w:pStyle w:val="ListParagraph"/>
+        <w:ind w:left="1440"/>
+        <w:rPr>
+          <w:rFonts w:ascii="Times New Roman" w:hAnsi="Times New Roman" w:cs="Times New Roman"/>
+        </w:rPr>
+      </w:pPr>
+    </w:p>
+    <w:p>
+      <w:pPr>
+        <w:pStyle w:val="ListParagraph"/>
+        <w:numPr>
+          <w:ilvl w:val="0"/>
+          <w:numId w:val="5"/>
+        </w:numPr>
+        <w:rPr>
+          <w:rFonts w:ascii="Times New Roman" w:hAnsi="Times New Roman" w:cs="Times New Roman"/>
+        </w:rPr>
+      </w:pPr>
+      <w:r>
+        <w:rPr>
+          <w:rFonts w:ascii="Times New Roman" w:hAnsi="Times New Roman" w:cs="Times New Roman"/>
+        </w:rPr>
+        <w:t>Was it easy for you to register an account and then log in to it? Were there any features that were missing from that process?</w:t>
+      </w:r>
+    </w:p>
+    <w:p>
+      <w:pPr>
+        <w:pStyle w:val="ListParagraph"/>
+        <w:numPr>
+          <w:ilvl w:val="1"/>
+          <w:numId w:val="5"/>
+        </w:numPr>
+        <w:rPr>
+          <w:rFonts w:ascii="Times New Roman" w:hAnsi="Times New Roman" w:cs="Times New Roman"/>
+        </w:rPr>
+      </w:pPr>
+      <w:r>
+        <w:rPr>
+          <w:rFonts w:ascii="Times New Roman" w:hAnsi="Times New Roman" w:cs="Times New Roman"/>
+        </w:rPr>
+        <w:t>Not that I can think of, it’s got name, email address, and phone number!</w:t>
+      </w:r>
+    </w:p>
+    <w:p>
+      <w:pPr>
+        <w:pStyle w:val="ListParagraph"/>
+        <w:ind w:left="1440"/>
+        <w:rPr>
+          <w:rFonts w:ascii="Times New Roman" w:hAnsi="Times New Roman" w:cs="Times New Roman"/>
+        </w:rPr>
+      </w:pPr>
+    </w:p>
+    <w:p>
+      <w:pPr>
+        <w:pStyle w:val="ListParagraph"/>
+        <w:numPr>
+          <w:ilvl w:val="0"/>
+          <w:numId w:val="5"/>
+        </w:numPr>
+        <w:rPr>
+          <w:rFonts w:ascii="Times New Roman" w:hAnsi="Times New Roman" w:cs="Times New Roman"/>
+        </w:rPr>
+      </w:pPr>
+      <w:r>
+        <w:rPr>
+          <w:rFonts w:ascii="Times New Roman" w:hAnsi="Times New Roman" w:cs="Times New Roman"/>
+        </w:rPr>
+        <w:t>Was the site easy to navigate?</w:t>
+      </w:r>
+    </w:p>
+    <w:p>
+      <w:pPr>
+        <w:pStyle w:val="ListParagraph"/>
+        <w:numPr>
+          <w:ilvl w:val="1"/>
+          <w:numId w:val="5"/>
+        </w:numPr>
+        <w:rPr>
+          <w:rFonts w:ascii="Times New Roman" w:hAnsi="Times New Roman" w:cs="Times New Roman"/>
+        </w:rPr>
+      </w:pPr>
+      <w:r>
+        <w:rPr>
+          <w:rFonts w:ascii="Times New Roman" w:hAnsi="Times New Roman" w:cs="Times New Roman"/>
+        </w:rPr>
+        <w:t>Absolutely</w:t>
+      </w:r>
+    </w:p>
+    <w:p>
+      <w:pPr>
+        <w:pStyle w:val="ListParagraph"/>
+        <w:ind w:left="1440"/>
+        <w:rPr>
+          <w:rFonts w:ascii="Times New Roman" w:hAnsi="Times New Roman" w:cs="Times New Roman"/>
+        </w:rPr>
+      </w:pPr>
+    </w:p>
+    <w:p>
+      <w:pPr>
+        <w:pStyle w:val="ListParagraph"/>
+        <w:numPr>
+          <w:ilvl w:val="0"/>
+          <w:numId w:val="5"/>
+        </w:numPr>
+        <w:rPr>
+          <w:rFonts w:ascii="Times New Roman" w:hAnsi="Times New Roman" w:cs="Times New Roman"/>
+        </w:rPr>
+      </w:pPr>
+      <w:r>
+        <w:rPr>
+          <w:rFonts w:ascii="Times New Roman" w:hAnsi="Times New Roman" w:cs="Times New Roman"/>
+        </w:rPr>
+        <w:t>What could be added to enhance the site?</w:t>
+      </w:r>
+    </w:p>
+    <w:p>
+      <w:pPr>
+        <w:pStyle w:val="ListParagraph"/>
+        <w:numPr>
+          <w:ilvl w:val="1"/>
+          <w:numId w:val="5"/>
+        </w:numPr>
+        <w:rPr>
+          <w:rFonts w:ascii="Times New Roman" w:hAnsi="Times New Roman" w:cs="Times New Roman"/>
+        </w:rPr>
+      </w:pPr>
+      <w:r>
+        <w:rPr>
+          <w:rFonts w:ascii="Times New Roman" w:hAnsi="Times New Roman" w:cs="Times New Roman"/>
+        </w:rPr>
+        <w:t xml:space="preserve">I know this is a mock trial, but maybe photos of the rooms while booking. </w:t>
+      </w:r>
+    </w:p>
+    <w:p>
+      <w:pPr>
+        <w:pStyle w:val="ListParagraph"/>
+        <w:ind w:left="1440"/>
+        <w:rPr>
+          <w:rFonts w:ascii="Times New Roman" w:hAnsi="Times New Roman" w:cs="Times New Roman"/>
+        </w:rPr>
+      </w:pPr>
+    </w:p>
+    <w:p>
+      <w:pPr>
+        <w:pStyle w:val="ListParagraph"/>
+        <w:numPr>
+          <w:ilvl w:val="0"/>
+          <w:numId w:val="5"/>
+        </w:numPr>
+        <w:spacing w:before="100" w:beforeAutospacing="1" w:after="100" w:afterAutospacing="1" w:line="240" w:lineRule="auto"/>
+        <w:rPr>
+          <w:rFonts w:ascii="Times New Roman" w:eastAsia="Times New Roman" w:hAnsi="Times New Roman" w:cs="Times New Roman"/>
+          <w:kern w:val="0"/>
+          <w14:ligatures w14:val="none"/>
+        </w:rPr>
+      </w:pPr>
+      <w:r>
+        <w:rPr>
+          <w:rFonts w:ascii="Times New Roman" w:eastAsia="Times New Roman" w:hAnsi="Times New Roman" w:cs="Times New Roman"/>
+          <w:kern w:val="0"/>
+          <w14:ligatures w14:val="none"/>
+        </w:rPr>
+        <w:t>Were all buttons, links, and navigation menus functioning properly throughout the website?</w:t>
+      </w:r>
+      <w:r>
+        <w:rPr>
+          <w:rFonts w:ascii="Times New Roman" w:eastAsia="Times New Roman" w:hAnsi="Times New Roman" w:cs="Times New Roman"/>
+          <w:kern w:val="0"/>
+          <w14:ligatures w14:val="none"/>
+        </w:rPr>
+        <w:br/>
+        <w:t xml:space="preserve">a. </w:t>
+      </w:r>
+      <w:r>
+        <w:rPr>
+          <w:rFonts w:ascii="Times New Roman" w:eastAsia="Times New Roman" w:hAnsi="Times New Roman" w:cs="Times New Roman"/>
+          <w:kern w:val="0"/>
+          <w14:ligatures w14:val="none"/>
+        </w:rPr>
+        <w:t>Yes, all links worked as expected</w:t>
+      </w:r>
+    </w:p>
+    <w:p>
+      <w:pPr>
+        <w:pStyle w:val="ListParagraph"/>
+        <w:spacing w:before="100" w:beforeAutospacing="1" w:after="100" w:afterAutospacing="1" w:line="240" w:lineRule="auto"/>
+        <w:rPr>
+          <w:rFonts w:ascii="Times New Roman" w:eastAsia="Times New Roman" w:hAnsi="Times New Roman" w:cs="Times New Roman"/>
+          <w:kern w:val="0"/>
+          <w14:ligatures w14:val="none"/>
+        </w:rPr>
+      </w:pPr>
+    </w:p>
+    <w:p>
+      <w:pPr>
+        <w:pStyle w:val="ListParagraph"/>
+        <w:numPr>
+          <w:ilvl w:val="0"/>
+          <w:numId w:val="5"/>
+        </w:numPr>
+        <w:spacing w:before="100" w:beforeAutospacing="1" w:after="100" w:afterAutospacing="1" w:line="240" w:lineRule="auto"/>
+        <w:rPr>
+          <w:rFonts w:ascii="Times New Roman" w:eastAsia="Times New Roman" w:hAnsi="Times New Roman" w:cs="Times New Roman"/>
+          <w:kern w:val="0"/>
+          <w14:ligatures w14:val="none"/>
+        </w:rPr>
+      </w:pPr>
+      <w:r>
+        <w:rPr>
+          <w:rFonts w:ascii="Times New Roman" w:eastAsia="Times New Roman" w:hAnsi="Times New Roman" w:cs="Times New Roman"/>
+          <w:kern w:val="0"/>
+          <w14:ligatures w14:val="none"/>
+        </w:rPr>
+        <w:t>Did the website pages load in a reasonable amount of time on your device? Explain if any pages seemed slow.</w:t>
+      </w:r>
+      <w:r>
+        <w:rPr>
+          <w:rFonts w:ascii="Times New Roman" w:eastAsia="Times New Roman" w:hAnsi="Times New Roman" w:cs="Times New Roman"/>
+          <w:kern w:val="0"/>
+          <w14:ligatures w14:val="none"/>
+        </w:rPr>
+        <w:br/>
+        <w:t xml:space="preserve">a. </w:t>
+      </w:r>
+      <w:r>
+        <w:rPr>
+          <w:rFonts w:ascii="Times New Roman" w:eastAsia="Times New Roman" w:hAnsi="Times New Roman" w:cs="Times New Roman"/>
+          <w:kern w:val="0"/>
+          <w14:ligatures w14:val="none"/>
+        </w:rPr>
+        <w:t>No, long wait times for the next page to load.</w:t>
+      </w:r>
+    </w:p>
+    <w:p>
+      <w:pPr>
+        <w:pStyle w:val="ListParagraph"/>
+        <w:rPr>
+          <w:rFonts w:ascii="Times New Roman" w:eastAsia="Times New Roman" w:hAnsi="Times New Roman" w:cs="Times New Roman"/>
+          <w:kern w:val="0"/>
+          <w14:ligatures w14:val="none"/>
+        </w:rPr>
+      </w:pPr>
+    </w:p>
+    <w:p>
+      <w:pPr>
+        <w:pStyle w:val="ListParagraph"/>
+        <w:spacing w:before="100" w:beforeAutospacing="1" w:after="100" w:afterAutospacing="1" w:line="240" w:lineRule="auto"/>
+        <w:rPr>
+          <w:rFonts w:ascii="Times New Roman" w:eastAsia="Times New Roman" w:hAnsi="Times New Roman" w:cs="Times New Roman"/>
+          <w:kern w:val="0"/>
+          <w14:ligatures w14:val="none"/>
+        </w:rPr>
+      </w:pPr>
+    </w:p>
+    <w:p>
+      <w:pPr>
+        <w:pStyle w:val="ListParagraph"/>
+        <w:numPr>
+          <w:ilvl w:val="0"/>
+          <w:numId w:val="5"/>
+        </w:numPr>
+        <w:spacing w:before="100" w:beforeAutospacing="1" w:after="100" w:afterAutospacing="1" w:line="240" w:lineRule="auto"/>
+        <w:rPr>
+          <w:rFonts w:ascii="Times New Roman" w:eastAsia="Times New Roman" w:hAnsi="Times New Roman" w:cs="Times New Roman"/>
+          <w:kern w:val="0"/>
+          <w14:ligatures w14:val="none"/>
+        </w:rPr>
+      </w:pPr>
+      <w:r>
+        <w:rPr>
+          <w:rFonts w:ascii="Times New Roman" w:eastAsia="Times New Roman" w:hAnsi="Times New Roman" w:cs="Times New Roman"/>
+          <w:kern w:val="0"/>
+          <w14:ligatures w14:val="none"/>
+        </w:rPr>
+        <w:t>Was the information on the website clear and easy to understand, including reservation details and pricing?</w:t>
+      </w:r>
+      <w:r>
+        <w:rPr>
+          <w:rFonts w:ascii="Times New Roman" w:eastAsia="Times New Roman" w:hAnsi="Times New Roman" w:cs="Times New Roman"/>
+          <w:kern w:val="0"/>
+          <w14:ligatures w14:val="none"/>
+        </w:rPr>
+        <w:br/>
+        <w:t xml:space="preserve">a. </w:t>
+      </w:r>
+      <w:r>
+        <w:rPr>
+          <w:rFonts w:ascii="Times New Roman" w:eastAsia="Times New Roman" w:hAnsi="Times New Roman" w:cs="Times New Roman"/>
+          <w:kern w:val="0"/>
+          <w14:ligatures w14:val="none"/>
+        </w:rPr>
+        <w:t>Yes, the information was easy to understand in that regard.</w:t>
+      </w:r>
+    </w:p>
+    <w:p>
+      <w:pPr>
+        <w:pStyle w:val="ListParagraph"/>
+        <w:spacing w:before="100" w:beforeAutospacing="1" w:after="100" w:afterAutospacing="1" w:line="240" w:lineRule="auto"/>
+        <w:rPr>
+          <w:rFonts w:ascii="Times New Roman" w:eastAsia="Times New Roman" w:hAnsi="Times New Roman" w:cs="Times New Roman"/>
+          <w:kern w:val="0"/>
+          <w14:ligatures w14:val="none"/>
+        </w:rPr>
+      </w:pPr>
+    </w:p>
+    <w:p>
+      <w:pPr>
+        <w:pStyle w:val="ListParagraph"/>
+        <w:numPr>
+          <w:ilvl w:val="0"/>
+          <w:numId w:val="5"/>
+        </w:numPr>
+        <w:spacing w:before="100" w:beforeAutospacing="1" w:after="100" w:afterAutospacing="1" w:line="240" w:lineRule="auto"/>
+        <w:rPr>
+          <w:rFonts w:ascii="Times New Roman" w:eastAsia="Times New Roman" w:hAnsi="Times New Roman" w:cs="Times New Roman"/>
+          <w:kern w:val="0"/>
+          <w14:ligatures w14:val="none"/>
+        </w:rPr>
+      </w:pPr>
+      <w:r>
+        <w:rPr>
+          <w:rFonts w:ascii="Times New Roman" w:eastAsia="Times New Roman" w:hAnsi="Times New Roman" w:cs="Times New Roman"/>
+          <w:kern w:val="0"/>
+          <w14:ligatures w14:val="none"/>
+        </w:rPr>
+        <w:t>Did the website make you feel confident and comfortable booking a reservation online? Why or why not?</w:t>
+      </w:r>
+      <w:r>
+        <w:rPr>
+          <w:rFonts w:ascii="Times New Roman" w:eastAsia="Times New Roman" w:hAnsi="Times New Roman" w:cs="Times New Roman"/>
+          <w:kern w:val="0"/>
+          <w14:ligatures w14:val="none"/>
+        </w:rPr>
+        <w:br/>
+        <w:t xml:space="preserve">a. </w:t>
+      </w:r>
+      <w:r>
+        <w:rPr>
+          <w:rFonts w:ascii="Times New Roman" w:eastAsia="Times New Roman" w:hAnsi="Times New Roman" w:cs="Times New Roman"/>
+          <w:kern w:val="0"/>
+          <w14:ligatures w14:val="none"/>
+        </w:rPr>
+        <w:t>Yes, I got all the right responses confirming the action went through.</w:t>
+      </w:r>
+    </w:p>
+    <w:p>
+      <w:pPr>
+        <w:pStyle w:val="ListParagraph"/>
+        <w:rPr>
+          <w:rFonts w:ascii="Times New Roman" w:eastAsia="Times New Roman" w:hAnsi="Times New Roman" w:cs="Times New Roman"/>
+          <w:kern w:val="0"/>
+          <w14:ligatures w14:val="none"/>
+        </w:rPr>
+      </w:pPr>
+    </w:p>
+    <w:p>
+      <w:pPr>
+        <w:pStyle w:val="ListParagraph"/>
+        <w:spacing w:before="100" w:beforeAutospacing="1" w:after="100" w:afterAutospacing="1" w:line="240" w:lineRule="auto"/>
+        <w:rPr>
+          <w:rFonts w:ascii="Times New Roman" w:eastAsia="Times New Roman" w:hAnsi="Times New Roman" w:cs="Times New Roman"/>
+          <w:kern w:val="0"/>
+          <w14:ligatures w14:val="none"/>
+        </w:rPr>
+      </w:pPr>
+    </w:p>
+    <w:p>
+      <w:pPr>
+        <w:pStyle w:val="ListParagraph"/>
+        <w:numPr>
+          <w:ilvl w:val="0"/>
+          <w:numId w:val="5"/>
+        </w:numPr>
+        <w:spacing w:before="100" w:beforeAutospacing="1" w:after="100" w:afterAutospacing="1" w:line="240" w:lineRule="auto"/>
+        <w:rPr>
+          <w:rFonts w:ascii="Times New Roman" w:eastAsia="Times New Roman" w:hAnsi="Times New Roman" w:cs="Times New Roman"/>
+          <w:kern w:val="0"/>
+          <w14:ligatures w14:val="none"/>
+        </w:rPr>
+      </w:pPr>
+      <w:r>
+        <w:rPr>
+          <w:rFonts w:ascii="Times New Roman" w:eastAsia="Times New Roman" w:hAnsi="Times New Roman" w:cs="Times New Roman"/>
+          <w:kern w:val="0"/>
+          <w14:ligatures w14:val="none"/>
+        </w:rPr>
+        <w:t>Was the layout of the website consistent across all pages, and did it help improve your overall experience?</w:t>
+      </w:r>
+      <w:r>
+        <w:rPr>
+          <w:rFonts w:ascii="Times New Roman" w:eastAsia="Times New Roman" w:hAnsi="Times New Roman" w:cs="Times New Roman"/>
+          <w:kern w:val="0"/>
+          <w14:ligatures w14:val="none"/>
+        </w:rPr>
+        <w:br/>
+        <w:t xml:space="preserve">a. </w:t>
+      </w:r>
+      <w:r>
+        <w:rPr>
+          <w:rFonts w:ascii="Times New Roman" w:eastAsia="Times New Roman" w:hAnsi="Times New Roman" w:cs="Times New Roman"/>
+          <w:kern w:val="0"/>
+          <w14:ligatures w14:val="none"/>
+        </w:rPr>
+        <w:t>The only thing I noticed was the links at the top of the page are on the right side of the page on the home page, but on all other pages they had shifted to the left side of the page.</w:t>
+      </w:r>
+    </w:p>
+    <w:p>
+      <w:pPr>
+        <w:pStyle w:val="ListParagraph"/>
+        <w:spacing w:before="100" w:beforeAutospacing="1" w:after="100" w:afterAutospacing="1" w:line="240" w:lineRule="auto"/>
+        <w:rPr>
+          <w:rFonts w:ascii="Times New Roman" w:eastAsia="Times New Roman" w:hAnsi="Times New Roman" w:cs="Times New Roman"/>
+          <w:kern w:val="0"/>
+          <w14:ligatures w14:val="none"/>
+        </w:rPr>
+      </w:pPr>
+    </w:p>
+    <w:p>
+      <w:pPr>
+        <w:numPr>
+          <w:ilvl w:val="0"/>
+          <w:numId w:val="5"/>
+        </w:numPr>
+        <w:spacing w:before="100" w:beforeAutospacing="1" w:after="100" w:afterAutospacing="1" w:line="240" w:lineRule="auto"/>
+        <w:rPr>
+          <w:rFonts w:ascii="Times New Roman" w:eastAsia="Times New Roman" w:hAnsi="Times New Roman" w:cs="Times New Roman"/>
+          <w:kern w:val="0"/>
+          <w14:ligatures w14:val="none"/>
+        </w:rPr>
+      </w:pPr>
+      <w:r>
+        <w:rPr>
+          <w:rFonts w:ascii="Times New Roman" w:eastAsia="Times New Roman" w:hAnsi="Times New Roman" w:cs="Times New Roman"/>
+          <w:kern w:val="0"/>
+          <w14:ligatures w14:val="none"/>
+        </w:rPr>
+        <w:t>Did you experience any errors, broken pages, or unexpected behavior while using the website? If so, explain.</w:t>
+      </w:r>
+      <w:r>
+        <w:rPr>
+          <w:rFonts w:ascii="Times New Roman" w:eastAsia="Times New Roman" w:hAnsi="Times New Roman" w:cs="Times New Roman"/>
+          <w:kern w:val="0"/>
+          <w14:ligatures w14:val="none"/>
+        </w:rPr>
+        <w:br/>
+        <w:t xml:space="preserve">a. </w:t>
+      </w:r>
+      <w:r>
+        <w:rPr>
+          <w:rFonts w:ascii="Times New Roman" w:eastAsia="Times New Roman" w:hAnsi="Times New Roman" w:cs="Times New Roman"/>
+          <w:kern w:val="0"/>
+          <w14:ligatures w14:val="none"/>
+        </w:rPr>
+        <w:t>No</w:t>
+      </w:r>
+    </w:p>
+    <w:p>
+      <w:pPr>
+        <w:spacing w:before="100" w:beforeAutospacing="1" w:after="100" w:afterAutospacing="1" w:line="240" w:lineRule="auto"/>
+        <w:rPr>
+          <w:rFonts w:ascii="Times New Roman" w:eastAsia="Times New Roman" w:hAnsi="Times New Roman" w:cs="Times New Roman"/>
+          <w:kern w:val="0"/>
+          <w14:ligatures w14:val="none"/>
+        </w:rPr>
+      </w:pPr>
+    </w:p>
+    <w:p>
+      <w:pPr>
+        <w:numPr>
+          <w:ilvl w:val="0"/>
+          <w:numId w:val="5"/>
+        </w:numPr>
+        <w:spacing w:before="100" w:beforeAutospacing="1" w:after="100" w:afterAutospacing="1" w:line="240" w:lineRule="auto"/>
+        <w:rPr>
+          <w:rFonts w:ascii="Times New Roman" w:eastAsia="Times New Roman" w:hAnsi="Times New Roman" w:cs="Times New Roman"/>
+          <w:kern w:val="0"/>
+          <w14:ligatures w14:val="none"/>
+        </w:rPr>
+      </w:pPr>
+      <w:r>
+        <w:rPr>
+          <w:rFonts w:ascii="Times New Roman" w:eastAsia="Times New Roman" w:hAnsi="Times New Roman" w:cs="Times New Roman"/>
+          <w:kern w:val="0"/>
+          <w14:ligatures w14:val="none"/>
+        </w:rPr>
+        <w:t>Did the reservation confirmation and account features provide enough feedback and information after completing actions?</w:t>
+      </w:r>
+      <w:r>
+        <w:rPr>
+          <w:rFonts w:ascii="Times New Roman" w:eastAsia="Times New Roman" w:hAnsi="Times New Roman" w:cs="Times New Roman"/>
+          <w:kern w:val="0"/>
+          <w14:ligatures w14:val="none"/>
+        </w:rPr>
+        <w:br/>
+        <w:t xml:space="preserve">a. </w:t>
+      </w:r>
+      <w:r>
+        <w:rPr>
+          <w:rFonts w:ascii="Times New Roman" w:eastAsia="Times New Roman" w:hAnsi="Times New Roman" w:cs="Times New Roman"/>
+          <w:kern w:val="0"/>
+          <w14:ligatures w14:val="none"/>
+        </w:rPr>
+        <w:t>Yes</w:t>
+      </w:r>
+    </w:p>
+    <w:p>
+      <w:pPr>
+        <w:pStyle w:val="ListParagraph"/>
+        <w:rPr>
+          <w:rFonts w:ascii="Times New Roman" w:eastAsia="Times New Roman" w:hAnsi="Times New Roman" w:cs="Times New Roman"/>
+          <w:kern w:val="0"/>
+          <w14:ligatures w14:val="none"/>
+        </w:rPr>
+      </w:pPr>
+    </w:p>
+    <w:p>
+      <w:pPr>
+        <w:spacing w:before="100" w:beforeAutospacing="1" w:after="100" w:afterAutospacing="1" w:line="240" w:lineRule="auto"/>
+        <w:rPr>
+          <w:rFonts w:ascii="Times New Roman" w:eastAsia="Times New Roman" w:hAnsi="Times New Roman" w:cs="Times New Roman"/>
+          <w:kern w:val="0"/>
+          <w14:ligatures w14:val="none"/>
+        </w:rPr>
+      </w:pPr>
+    </w:p>
+    <w:p>
+      <w:pPr>
+        <w:numPr>
+          <w:ilvl w:val="0"/>
+          <w:numId w:val="5"/>
+        </w:numPr>
+        <w:spacing w:before="100" w:beforeAutospacing="1" w:after="100" w:afterAutospacing="1" w:line="240" w:lineRule="auto"/>
+        <w:rPr>
+          <w:rFonts w:ascii="Times New Roman" w:eastAsia="Times New Roman" w:hAnsi="Times New Roman" w:cs="Times New Roman"/>
+          <w:kern w:val="0"/>
+          <w14:ligatures w14:val="none"/>
+        </w:rPr>
+      </w:pPr>
+      <w:r>
+        <w:rPr>
+          <w:rFonts w:ascii="Times New Roman" w:eastAsia="Times New Roman" w:hAnsi="Times New Roman" w:cs="Times New Roman"/>
+          <w:kern w:val="0"/>
+          <w14:ligatures w14:val="none"/>
+        </w:rPr>
+        <w:t>Were the fonts, text sizes, and overall readability comfortable throughout the website?</w:t>
+      </w:r>
+      <w:r>
+        <w:rPr>
+          <w:rFonts w:ascii="Times New Roman" w:eastAsia="Times New Roman" w:hAnsi="Times New Roman" w:cs="Times New Roman"/>
+          <w:kern w:val="0"/>
+          <w14:ligatures w14:val="none"/>
+        </w:rPr>
+        <w:br/>
+        <w:t xml:space="preserve">a. </w:t>
+      </w:r>
+      <w:r>
+        <w:rPr>
+          <w:rFonts w:ascii="Times New Roman" w:eastAsia="Times New Roman" w:hAnsi="Times New Roman" w:cs="Times New Roman"/>
+          <w:kern w:val="0"/>
+          <w14:ligatures w14:val="none"/>
+        </w:rPr>
+        <w:t>Yes, no troubles there</w:t>
+      </w:r>
+    </w:p>
+    <w:p>
+      <w:pPr>
+        <w:spacing w:before="100" w:beforeAutospacing="1" w:after="100" w:afterAutospacing="1" w:line="240" w:lineRule="auto"/>
+        <w:ind w:left="720"/>
+        <w:rPr>
+          <w:rFonts w:ascii="Times New Roman" w:eastAsia="Times New Roman" w:hAnsi="Times New Roman" w:cs="Times New Roman"/>
+          <w:kern w:val="0"/>
+          <w14:ligatures w14:val="none"/>
+        </w:rPr>
+      </w:pPr>
+    </w:p>
+    <w:p>
+      <w:pPr>
+        <w:numPr>
+          <w:ilvl w:val="0"/>
+          <w:numId w:val="5"/>
+        </w:numPr>
+        <w:spacing w:before="100" w:beforeAutospacing="1" w:after="100" w:afterAutospacing="1" w:line="240" w:lineRule="auto"/>
+        <w:rPr>
+          <w:rFonts w:ascii="Times New Roman" w:eastAsia="Times New Roman" w:hAnsi="Times New Roman" w:cs="Times New Roman"/>
+          <w:kern w:val="0"/>
+          <w14:ligatures w14:val="none"/>
+        </w:rPr>
+      </w:pPr>
+      <w:r>
+        <w:rPr>
+          <w:rFonts w:ascii="Times New Roman" w:eastAsia="Times New Roman" w:hAnsi="Times New Roman" w:cs="Times New Roman"/>
+          <w:kern w:val="0"/>
+          <w14:ligatures w14:val="none"/>
+        </w:rPr>
+        <w:t>If you were planning a real vacation, would you personally use this website to book a stay at Moffat Bay Lodge? Why or why not?</w:t>
+      </w:r>
+      <w:r>
+        <w:rPr>
+          <w:rFonts w:ascii="Times New Roman" w:eastAsia="Times New Roman" w:hAnsi="Times New Roman" w:cs="Times New Roman"/>
+          <w:kern w:val="0"/>
+          <w14:ligatures w14:val="none"/>
+        </w:rPr>
+        <w:br/>
+        <w:t xml:space="preserve">a. </w:t>
+      </w:r>
+      <w:r>
+        <w:rPr>
+          <w:rFonts w:ascii="Times New Roman" w:eastAsia="Times New Roman" w:hAnsi="Times New Roman" w:cs="Times New Roman"/>
+          <w:kern w:val="0"/>
+          <w14:ligatures w14:val="none"/>
+        </w:rPr>
+        <w:t>Yes, provided I was able to see some pictures of the property, rooms, etc.</w:t>
+      </w:r>
+    </w:p>
+    <w:p>
+      <w:pPr>
+        <w:spacing w:before="100" w:beforeAutospacing="1" w:after="100" w:afterAutospacing="1" w:line="240" w:lineRule="auto"/>
+        <w:ind w:left="720"/>
+        <w:rPr>
+          <w:rFonts w:ascii="Times New Roman" w:eastAsia="Times New Roman" w:hAnsi="Times New Roman" w:cs="Times New Roman"/>
+          <w:kern w:val="0"/>
+          <w14:ligatures w14:val="none"/>
+        </w:rPr>
+      </w:pPr>
+    </w:p>
+    <w:p>
+      <w:pPr>
+        <w:spacing w:before="100" w:beforeAutospacing="1" w:after="100" w:afterAutospacing="1" w:line="240" w:lineRule="auto"/>
+        <w:ind w:left="720"/>
+        <w:rPr>
+          <w:rFonts w:ascii="Times New Roman" w:eastAsia="Times New Roman" w:hAnsi="Times New Roman" w:cs="Times New Roman"/>
+          <w:kern w:val="0"/>
+          <w14:ligatures w14:val="none"/>
+        </w:rPr>
+      </w:pPr>
+    </w:p>
+    <w:p>
+      <w:pPr>
+        <w:rPr>
+          <w:rFonts w:ascii="Times New Roman" w:hAnsi="Times New Roman" w:cs="Times New Roman"/>
+        </w:rPr>
+      </w:pPr>
+    </w:p>
+    <w:p>
+      <w:pPr>
+        <w:pStyle w:val="Heading1"/>
         <w:rPr>
           <w:rFonts w:ascii="Times New Roman" w:hAnsi="Times New Roman" w:cs="Times New Roman"/>
           <w:b/>
@@ -931,6 +901,17 @@
           <w:sz w:val="24"/>
           <w:szCs w:val="24"/>
         </w:rPr>
+      </w:pPr>
+      <w:r>
+        <w:rPr>
+          <w:rFonts w:ascii="Times New Roman" w:hAnsi="Times New Roman" w:cs="Times New Roman"/>
+          <w:b/>
+          <w:bCs/>
+          <w:color w:val="000000" w:themeColor="text1"/>
+          <w:sz w:val="24"/>
+          <w:szCs w:val="24"/>
+        </w:rPr>
+        <w:lastRenderedPageBreak/>
         <w:t>David P (Angela V)</w:t>
       </w:r>
     </w:p>
@@ -1044,19 +1025,7 @@
         <w:rPr>
           <w:rFonts w:ascii="Times New Roman" w:hAnsi="Times New Roman" w:cs="Times New Roman"/>
         </w:rPr>
-        <w:t xml:space="preserve">The colors and images matched the theme of the lodge well and made the site feel </w:t>
-      </w:r>
-      <w:r>
-        <w:rPr>
-          <w:rFonts w:ascii="Times New Roman" w:hAnsi="Times New Roman" w:cs="Times New Roman"/>
-        </w:rPr>
-        <w:t>relaxed</w:t>
-      </w:r>
-      <w:r>
-        <w:rPr>
-          <w:rFonts w:ascii="Times New Roman" w:hAnsi="Times New Roman" w:cs="Times New Roman"/>
-        </w:rPr>
-        <w:t xml:space="preserve"> and organized.</w:t>
+        <w:t>The colors and images matched the theme of the lodge well and made the site feel relaxed and organized.</w:t>
       </w:r>
       <w:r>
         <w:rPr>
@@ -1113,21 +1082,7 @@
         <w:rPr>
           <w:rFonts w:ascii="Times New Roman" w:hAnsi="Times New Roman" w:cs="Times New Roman"/>
         </w:rPr>
-        <w:t xml:space="preserve"> and felt like I </w:t>
-      </w:r>
-      <w:proofErr w:type="gramStart"/>
-      <w:r>
-        <w:rPr>
-          <w:rFonts w:ascii="Times New Roman" w:hAnsi="Times New Roman" w:cs="Times New Roman"/>
-        </w:rPr>
-        <w:t>have</w:t>
-      </w:r>
-      <w:proofErr w:type="gramEnd"/>
-      <w:r>
-        <w:rPr>
-          <w:rFonts w:ascii="Times New Roman" w:hAnsi="Times New Roman" w:cs="Times New Roman"/>
-        </w:rPr>
-        <w:t xml:space="preserve"> done it before</w:t>
+        <w:t xml:space="preserve"> and felt like I have done it before</w:t>
       </w:r>
       <w:r>
         <w:rPr>
@@ -1139,23 +1094,7 @@
         <w:rPr>
           <w:rFonts w:ascii="Times New Roman" w:hAnsi="Times New Roman" w:cs="Times New Roman"/>
         </w:rPr>
-        <w:t xml:space="preserve"> mainly because it does look like any other site which is good because </w:t>
-      </w:r>
-      <w:proofErr w:type="spellStart"/>
-      <w:proofErr w:type="gramStart"/>
-      <w:r>
-        <w:rPr>
-          <w:rFonts w:ascii="Times New Roman" w:hAnsi="Times New Roman" w:cs="Times New Roman"/>
-        </w:rPr>
-        <w:t>its</w:t>
-      </w:r>
-      <w:proofErr w:type="spellEnd"/>
-      <w:proofErr w:type="gramEnd"/>
-      <w:r>
-        <w:rPr>
-          <w:rFonts w:ascii="Times New Roman" w:hAnsi="Times New Roman" w:cs="Times New Roman"/>
-        </w:rPr>
-        <w:t xml:space="preserve"> not confusing</w:t>
+        <w:t xml:space="preserve"> mainly because it does look like any other site which is good because its not confusing</w:t>
       </w:r>
       <w:r>
         <w:rPr>
@@ -1239,7 +1178,6 @@
         <w:rPr>
           <w:rFonts w:ascii="Times New Roman" w:hAnsi="Times New Roman" w:cs="Times New Roman"/>
         </w:rPr>
-        <w:lastRenderedPageBreak/>
         <w:t>What could be added to enhance the site?</w:t>
       </w:r>
     </w:p>
@@ -1308,23 +1246,13 @@
           <w14:ligatures w14:val="none"/>
         </w:rPr>
       </w:pPr>
-      <w:proofErr w:type="gramStart"/>
-      <w:r>
-        <w:rPr>
-          <w:rFonts w:ascii="Times New Roman" w:eastAsia="Times New Roman" w:hAnsi="Times New Roman" w:cs="Times New Roman"/>
-          <w:kern w:val="0"/>
-          <w14:ligatures w14:val="none"/>
-        </w:rPr>
-        <w:t>Were</w:t>
-      </w:r>
-      <w:proofErr w:type="gramEnd"/>
-      <w:r>
-        <w:rPr>
-          <w:rFonts w:ascii="Times New Roman" w:eastAsia="Times New Roman" w:hAnsi="Times New Roman" w:cs="Times New Roman"/>
-          <w:kern w:val="0"/>
-          <w14:ligatures w14:val="none"/>
-        </w:rPr>
-        <w:t xml:space="preserve"> all buttons, links, and navigation menus functioning properly throughout the website?</w:t>
+      <w:r>
+        <w:rPr>
+          <w:rFonts w:ascii="Times New Roman" w:eastAsia="Times New Roman" w:hAnsi="Times New Roman" w:cs="Times New Roman"/>
+          <w:kern w:val="0"/>
+          <w14:ligatures w14:val="none"/>
+        </w:rPr>
+        <w:t>Were all buttons, links, and navigation menus functioning properly throughout the website?</w:t>
       </w:r>
       <w:r>
         <w:rPr>
@@ -1400,18 +1328,8 @@
           <w:kern w:val="0"/>
           <w14:ligatures w14:val="none"/>
         </w:rPr>
-        <w:t xml:space="preserve">The website loaded quickly on my device during testing. I did not experience any major delays while switching between pages. Overall, the performance felt smooth and </w:t>
-      </w:r>
-      <w:proofErr w:type="gramStart"/>
-      <w:r>
-        <w:rPr>
-          <w:rFonts w:ascii="Times New Roman" w:eastAsia="Times New Roman" w:hAnsi="Times New Roman" w:cs="Times New Roman"/>
-          <w:kern w:val="0"/>
-          <w14:ligatures w14:val="none"/>
-        </w:rPr>
-        <w:t>responsive</w:t>
-      </w:r>
-      <w:proofErr w:type="gramEnd"/>
+        <w:t>The website loaded quickly on my device during testing. I did not experience any major delays while switching between pages. Overall, the performance felt smooth and responsive</w:t>
+      </w:r>
       <w:r>
         <w:rPr>
           <w:rFonts w:ascii="Times New Roman" w:eastAsia="Times New Roman" w:hAnsi="Times New Roman" w:cs="Times New Roman"/>
@@ -1487,25 +1405,7 @@
           <w:kern w:val="0"/>
           <w14:ligatures w14:val="none"/>
         </w:rPr>
-        <w:t xml:space="preserve"> The only thing is that they should add in some complimentary pricing for users that are already registered and maybe </w:t>
-      </w:r>
-      <w:proofErr w:type="gramStart"/>
-      <w:r>
-        <w:rPr>
-          <w:rFonts w:ascii="Times New Roman" w:eastAsia="Times New Roman" w:hAnsi="Times New Roman" w:cs="Times New Roman"/>
-          <w:kern w:val="0"/>
-          <w14:ligatures w14:val="none"/>
-        </w:rPr>
-        <w:t>difference</w:t>
-      </w:r>
-      <w:proofErr w:type="gramEnd"/>
-      <w:r>
-        <w:rPr>
-          <w:rFonts w:ascii="Times New Roman" w:eastAsia="Times New Roman" w:hAnsi="Times New Roman" w:cs="Times New Roman"/>
-          <w:kern w:val="0"/>
-          <w14:ligatures w14:val="none"/>
-        </w:rPr>
-        <w:t xml:space="preserve"> in holidays. </w:t>
+        <w:t xml:space="preserve"> The only thing is that they should add in some complimentary pricing for users that are already registered and maybe difference in holidays. </w:t>
       </w:r>
     </w:p>
     <w:p>
@@ -1656,6 +1556,139 @@
           <w14:ligatures w14:val="none"/>
         </w:rPr>
         <w:br/>
+        <w:t xml:space="preserve">a. </w:t>
+      </w:r>
+      <w:r>
+        <w:rPr>
+          <w:rFonts w:ascii="Times New Roman" w:eastAsia="Times New Roman" w:hAnsi="Times New Roman" w:cs="Times New Roman"/>
+          <w:kern w:val="0"/>
+          <w14:ligatures w14:val="none"/>
+        </w:rPr>
+        <w:t>I did not experience any major issues while testing the website. All pages loaded correctly and functioned as expected. The overall experience felt stable and smooth.</w:t>
+      </w:r>
+    </w:p>
+    <w:p>
+      <w:pPr>
+        <w:numPr>
+          <w:ilvl w:val="0"/>
+          <w:numId w:val="5"/>
+        </w:numPr>
+        <w:spacing w:before="100" w:beforeAutospacing="1" w:after="100" w:afterAutospacing="1" w:line="240" w:lineRule="auto"/>
+        <w:rPr>
+          <w:rFonts w:ascii="Times New Roman" w:eastAsia="Times New Roman" w:hAnsi="Times New Roman" w:cs="Times New Roman"/>
+          <w:kern w:val="0"/>
+          <w14:ligatures w14:val="none"/>
+        </w:rPr>
+      </w:pPr>
+      <w:r>
+        <w:rPr>
+          <w:rFonts w:ascii="Times New Roman" w:eastAsia="Times New Roman" w:hAnsi="Times New Roman" w:cs="Times New Roman"/>
+          <w:kern w:val="0"/>
+          <w14:ligatures w14:val="none"/>
+        </w:rPr>
+        <w:t>Did the reservation confirmation and account features provide enough feedback and information after completing actions?</w:t>
+      </w:r>
+      <w:r>
+        <w:rPr>
+          <w:rFonts w:ascii="Times New Roman" w:eastAsia="Times New Roman" w:hAnsi="Times New Roman" w:cs="Times New Roman"/>
+          <w:kern w:val="0"/>
+          <w14:ligatures w14:val="none"/>
+        </w:rPr>
+        <w:br/>
+        <w:t xml:space="preserve">a. </w:t>
+      </w:r>
+      <w:r>
+        <w:rPr>
+          <w:rFonts w:ascii="Times New Roman" w:eastAsia="Times New Roman" w:hAnsi="Times New Roman" w:cs="Times New Roman"/>
+          <w:kern w:val="0"/>
+          <w14:ligatures w14:val="none"/>
+        </w:rPr>
+        <w:t>Yes, the confirmation and account features provided clear feedback after actions were completed. The messages helped confirm that reservations and logins were successful. This made the website feel more reliable and user friendly</w:t>
+      </w:r>
+      <w:r>
+        <w:rPr>
+          <w:rFonts w:ascii="Times New Roman" w:eastAsia="Times New Roman" w:hAnsi="Times New Roman" w:cs="Times New Roman"/>
+          <w:kern w:val="0"/>
+          <w14:ligatures w14:val="none"/>
+        </w:rPr>
+        <w:t>. I do think that when one logs in and does a reservation, they should also get a message about how to view the reservation since it will be on a different tab.</w:t>
+      </w:r>
+      <w:r>
+        <w:rPr>
+          <w:rFonts w:ascii="Times New Roman" w:eastAsia="Times New Roman" w:hAnsi="Times New Roman" w:cs="Times New Roman"/>
+          <w:kern w:val="0"/>
+          <w14:ligatures w14:val="none"/>
+        </w:rPr>
+        <w:t xml:space="preserve"> </w:t>
+      </w:r>
+    </w:p>
+    <w:p>
+      <w:pPr>
+        <w:numPr>
+          <w:ilvl w:val="0"/>
+          <w:numId w:val="5"/>
+        </w:numPr>
+        <w:spacing w:before="100" w:beforeAutospacing="1" w:after="100" w:afterAutospacing="1" w:line="240" w:lineRule="auto"/>
+        <w:rPr>
+          <w:rFonts w:ascii="Times New Roman" w:eastAsia="Times New Roman" w:hAnsi="Times New Roman" w:cs="Times New Roman"/>
+          <w:kern w:val="0"/>
+          <w14:ligatures w14:val="none"/>
+        </w:rPr>
+      </w:pPr>
+      <w:r>
+        <w:rPr>
+          <w:rFonts w:ascii="Times New Roman" w:eastAsia="Times New Roman" w:hAnsi="Times New Roman" w:cs="Times New Roman"/>
+          <w:kern w:val="0"/>
+          <w14:ligatures w14:val="none"/>
+        </w:rPr>
+        <w:t>Were the fonts, text sizes, and overall readability comfortable throughout the website?</w:t>
+      </w:r>
+      <w:r>
+        <w:rPr>
+          <w:rFonts w:ascii="Times New Roman" w:eastAsia="Times New Roman" w:hAnsi="Times New Roman" w:cs="Times New Roman"/>
+          <w:kern w:val="0"/>
+          <w14:ligatures w14:val="none"/>
+        </w:rPr>
+        <w:br/>
+        <w:t xml:space="preserve">a. </w:t>
+      </w:r>
+      <w:r>
+        <w:rPr>
+          <w:rFonts w:ascii="Times New Roman" w:eastAsia="Times New Roman" w:hAnsi="Times New Roman" w:cs="Times New Roman"/>
+          <w:kern w:val="0"/>
+          <w14:ligatures w14:val="none"/>
+        </w:rPr>
+        <w:t>The fonts and text sizes were easy to read throughout the website. The formatting looked clean and organized on each page. Overall readability was comfortable and consistent.</w:t>
+      </w:r>
+    </w:p>
+    <w:p>
+      <w:pPr>
+        <w:numPr>
+          <w:ilvl w:val="0"/>
+          <w:numId w:val="5"/>
+        </w:numPr>
+        <w:spacing w:before="100" w:beforeAutospacing="1" w:after="100" w:afterAutospacing="1" w:line="240" w:lineRule="auto"/>
+        <w:rPr>
+          <w:rFonts w:ascii="Times New Roman" w:eastAsia="Times New Roman" w:hAnsi="Times New Roman" w:cs="Times New Roman"/>
+          <w:kern w:val="0"/>
+          <w14:ligatures w14:val="none"/>
+        </w:rPr>
+      </w:pPr>
+      <w:r>
+        <w:rPr>
+          <w:rFonts w:ascii="Times New Roman" w:eastAsia="Times New Roman" w:hAnsi="Times New Roman" w:cs="Times New Roman"/>
+          <w:kern w:val="0"/>
+          <w14:ligatures w14:val="none"/>
+        </w:rPr>
+        <w:t>If you were planning a real vacation, would you personally use this website to book a stay at Moffat Bay Lodge? Why or why not?</w:t>
+      </w:r>
+      <w:r>
+        <w:rPr>
+          <w:rFonts w:ascii="Times New Roman" w:eastAsia="Times New Roman" w:hAnsi="Times New Roman" w:cs="Times New Roman"/>
+          <w:kern w:val="0"/>
+          <w14:ligatures w14:val="none"/>
+        </w:rPr>
+        <w:br/>
       </w:r>
       <w:r>
         <w:rPr>
@@ -1672,238 +1705,15 @@
           <w:kern w:val="0"/>
           <w14:ligatures w14:val="none"/>
         </w:rPr>
-        <w:t>I did not experience any major issues while testing the website. All pages loaded correctly and functioned as expected. The overall experience felt stable and smooth.</w:t>
-      </w:r>
-    </w:p>
-    <w:p>
-      <w:pPr>
-        <w:numPr>
-          <w:ilvl w:val="0"/>
-          <w:numId w:val="5"/>
-        </w:numPr>
-        <w:spacing w:before="100" w:beforeAutospacing="1" w:after="100" w:afterAutospacing="1" w:line="240" w:lineRule="auto"/>
-        <w:rPr>
-          <w:rFonts w:ascii="Times New Roman" w:eastAsia="Times New Roman" w:hAnsi="Times New Roman" w:cs="Times New Roman"/>
-          <w:kern w:val="0"/>
-          <w14:ligatures w14:val="none"/>
-        </w:rPr>
-      </w:pPr>
-      <w:r>
-        <w:rPr>
-          <w:rFonts w:ascii="Times New Roman" w:eastAsia="Times New Roman" w:hAnsi="Times New Roman" w:cs="Times New Roman"/>
-          <w:kern w:val="0"/>
-          <w14:ligatures w14:val="none"/>
-        </w:rPr>
-        <w:t>Did the reservation confirmation and account features provide enough feedback and information after completing actions?</w:t>
-      </w:r>
-      <w:r>
-        <w:rPr>
-          <w:rFonts w:ascii="Times New Roman" w:eastAsia="Times New Roman" w:hAnsi="Times New Roman" w:cs="Times New Roman"/>
-          <w:kern w:val="0"/>
-          <w14:ligatures w14:val="none"/>
-        </w:rPr>
-        <w:br/>
-        <w:t xml:space="preserve">a. </w:t>
-      </w:r>
-      <w:r>
-        <w:rPr>
-          <w:rFonts w:ascii="Times New Roman" w:eastAsia="Times New Roman" w:hAnsi="Times New Roman" w:cs="Times New Roman"/>
-          <w:kern w:val="0"/>
-          <w14:ligatures w14:val="none"/>
-        </w:rPr>
-        <w:t>Yes, the confirmation and account features provided clear feedback after actions were completed. The messages helped confirm that reservations and logins were successful. This made the website feel more reliable and user friendly</w:t>
-      </w:r>
-      <w:r>
-        <w:rPr>
-          <w:rFonts w:ascii="Times New Roman" w:eastAsia="Times New Roman" w:hAnsi="Times New Roman" w:cs="Times New Roman"/>
-          <w:kern w:val="0"/>
-          <w14:ligatures w14:val="none"/>
-        </w:rPr>
-        <w:t xml:space="preserve">. I do think that when one logs in and </w:t>
-      </w:r>
-      <w:proofErr w:type="gramStart"/>
-      <w:r>
-        <w:rPr>
-          <w:rFonts w:ascii="Times New Roman" w:eastAsia="Times New Roman" w:hAnsi="Times New Roman" w:cs="Times New Roman"/>
-          <w:kern w:val="0"/>
-          <w14:ligatures w14:val="none"/>
-        </w:rPr>
-        <w:t>does</w:t>
-      </w:r>
-      <w:proofErr w:type="gramEnd"/>
-      <w:r>
-        <w:rPr>
-          <w:rFonts w:ascii="Times New Roman" w:eastAsia="Times New Roman" w:hAnsi="Times New Roman" w:cs="Times New Roman"/>
-          <w:kern w:val="0"/>
-          <w14:ligatures w14:val="none"/>
-        </w:rPr>
-        <w:t xml:space="preserve"> a reservation, they should also get a message about how to view the reservation since it will be on a different tab.</w:t>
-      </w:r>
-      <w:r>
-        <w:rPr>
-          <w:rFonts w:ascii="Times New Roman" w:eastAsia="Times New Roman" w:hAnsi="Times New Roman" w:cs="Times New Roman"/>
-          <w:kern w:val="0"/>
-          <w14:ligatures w14:val="none"/>
-        </w:rPr>
-        <w:t xml:space="preserve"> </w:t>
-      </w:r>
-    </w:p>
-    <w:p>
-      <w:pPr>
-        <w:numPr>
-          <w:ilvl w:val="0"/>
-          <w:numId w:val="5"/>
-        </w:numPr>
-        <w:spacing w:before="100" w:beforeAutospacing="1" w:after="100" w:afterAutospacing="1" w:line="240" w:lineRule="auto"/>
-        <w:rPr>
-          <w:rFonts w:ascii="Times New Roman" w:eastAsia="Times New Roman" w:hAnsi="Times New Roman" w:cs="Times New Roman"/>
-          <w:kern w:val="0"/>
-          <w14:ligatures w14:val="none"/>
-        </w:rPr>
-      </w:pPr>
-      <w:r>
-        <w:rPr>
-          <w:rFonts w:ascii="Times New Roman" w:eastAsia="Times New Roman" w:hAnsi="Times New Roman" w:cs="Times New Roman"/>
-          <w:kern w:val="0"/>
-          <w14:ligatures w14:val="none"/>
-        </w:rPr>
-        <w:t>Were the fonts, text sizes, and overall readability comfortable throughout the website?</w:t>
-      </w:r>
-      <w:r>
-        <w:rPr>
-          <w:rFonts w:ascii="Times New Roman" w:eastAsia="Times New Roman" w:hAnsi="Times New Roman" w:cs="Times New Roman"/>
-          <w:kern w:val="0"/>
-          <w14:ligatures w14:val="none"/>
-        </w:rPr>
-        <w:br/>
-        <w:t xml:space="preserve">a. </w:t>
-      </w:r>
-      <w:r>
-        <w:rPr>
-          <w:rFonts w:ascii="Times New Roman" w:eastAsia="Times New Roman" w:hAnsi="Times New Roman" w:cs="Times New Roman"/>
-          <w:kern w:val="0"/>
-          <w14:ligatures w14:val="none"/>
-        </w:rPr>
-        <w:t>The fonts and text sizes were easy to read throughout the website. The formatting looked clean and organized on each page. Overall readability was comfortable and consistent.</w:t>
-      </w:r>
-    </w:p>
-    <w:p>
-      <w:pPr>
-        <w:numPr>
-          <w:ilvl w:val="0"/>
-          <w:numId w:val="5"/>
-        </w:numPr>
-        <w:spacing w:before="100" w:beforeAutospacing="1" w:after="100" w:afterAutospacing="1" w:line="240" w:lineRule="auto"/>
-        <w:rPr>
-          <w:rFonts w:ascii="Times New Roman" w:eastAsia="Times New Roman" w:hAnsi="Times New Roman" w:cs="Times New Roman"/>
-          <w:kern w:val="0"/>
-          <w14:ligatures w14:val="none"/>
-        </w:rPr>
-      </w:pPr>
-      <w:r>
-        <w:rPr>
-          <w:rFonts w:ascii="Times New Roman" w:eastAsia="Times New Roman" w:hAnsi="Times New Roman" w:cs="Times New Roman"/>
-          <w:kern w:val="0"/>
-          <w14:ligatures w14:val="none"/>
-        </w:rPr>
-        <w:t>If you were planning a real vacation, would you personally use this website to book a stay at Moffat Bay Lodge? Why or why not?</w:t>
-      </w:r>
-      <w:r>
-        <w:rPr>
-          <w:rFonts w:ascii="Times New Roman" w:eastAsia="Times New Roman" w:hAnsi="Times New Roman" w:cs="Times New Roman"/>
-          <w:kern w:val="0"/>
-          <w14:ligatures w14:val="none"/>
-        </w:rPr>
-        <w:br/>
-        <w:t xml:space="preserve">a. </w:t>
-      </w:r>
-      <w:r>
-        <w:rPr>
-          <w:rFonts w:ascii="Times New Roman" w:eastAsia="Times New Roman" w:hAnsi="Times New Roman" w:cs="Times New Roman"/>
-          <w:kern w:val="0"/>
-          <w14:ligatures w14:val="none"/>
-        </w:rPr>
-        <w:t xml:space="preserve">Yes, I would use this website to book a stay at Moffat Bay Lodge. The reservation process was </w:t>
-      </w:r>
-      <w:proofErr w:type="gramStart"/>
-      <w:r>
-        <w:rPr>
-          <w:rFonts w:ascii="Times New Roman" w:eastAsia="Times New Roman" w:hAnsi="Times New Roman" w:cs="Times New Roman"/>
-          <w:kern w:val="0"/>
-          <w14:ligatures w14:val="none"/>
-        </w:rPr>
-        <w:t>simple</w:t>
-      </w:r>
-      <w:proofErr w:type="gramEnd"/>
-      <w:r>
-        <w:rPr>
-          <w:rFonts w:ascii="Times New Roman" w:eastAsia="Times New Roman" w:hAnsi="Times New Roman" w:cs="Times New Roman"/>
-          <w:kern w:val="0"/>
-          <w14:ligatures w14:val="none"/>
-        </w:rPr>
-        <w:t xml:space="preserve"> and the website was easy to navigate. The design also made the site feel welcoming and professional.</w:t>
-      </w:r>
-      <w:r>
-        <w:rPr>
-          <w:rFonts w:ascii="Times New Roman" w:eastAsia="Times New Roman" w:hAnsi="Times New Roman" w:cs="Times New Roman"/>
-          <w:kern w:val="0"/>
-          <w14:ligatures w14:val="none"/>
-        </w:rPr>
-        <w:t xml:space="preserve"> The only </w:t>
-      </w:r>
-      <w:proofErr w:type="gramStart"/>
-      <w:r>
-        <w:rPr>
-          <w:rFonts w:ascii="Times New Roman" w:eastAsia="Times New Roman" w:hAnsi="Times New Roman" w:cs="Times New Roman"/>
-          <w:kern w:val="0"/>
-          <w14:ligatures w14:val="none"/>
-        </w:rPr>
-        <w:t>thing is</w:t>
-      </w:r>
-      <w:proofErr w:type="gramEnd"/>
-      <w:r>
-        <w:rPr>
-          <w:rFonts w:ascii="Times New Roman" w:eastAsia="Times New Roman" w:hAnsi="Times New Roman" w:cs="Times New Roman"/>
-          <w:kern w:val="0"/>
-          <w14:ligatures w14:val="none"/>
-        </w:rPr>
-        <w:t xml:space="preserve"> </w:t>
-      </w:r>
-      <w:proofErr w:type="spellStart"/>
-      <w:r>
-        <w:rPr>
-          <w:rFonts w:ascii="Times New Roman" w:eastAsia="Times New Roman" w:hAnsi="Times New Roman" w:cs="Times New Roman"/>
-          <w:kern w:val="0"/>
-          <w14:ligatures w14:val="none"/>
-        </w:rPr>
-        <w:t>is</w:t>
-      </w:r>
-      <w:proofErr w:type="spellEnd"/>
-      <w:r>
-        <w:rPr>
-          <w:rFonts w:ascii="Times New Roman" w:eastAsia="Times New Roman" w:hAnsi="Times New Roman" w:cs="Times New Roman"/>
-          <w:kern w:val="0"/>
-          <w14:ligatures w14:val="none"/>
-        </w:rPr>
-        <w:t xml:space="preserve"> that I would have difficulty </w:t>
-      </w:r>
-      <w:proofErr w:type="gramStart"/>
-      <w:r>
-        <w:rPr>
-          <w:rFonts w:ascii="Times New Roman" w:eastAsia="Times New Roman" w:hAnsi="Times New Roman" w:cs="Times New Roman"/>
-          <w:kern w:val="0"/>
-          <w14:ligatures w14:val="none"/>
-        </w:rPr>
-        <w:t>on</w:t>
-      </w:r>
-      <w:proofErr w:type="gramEnd"/>
-      <w:r>
-        <w:rPr>
-          <w:rFonts w:ascii="Times New Roman" w:eastAsia="Times New Roman" w:hAnsi="Times New Roman" w:cs="Times New Roman"/>
-          <w:kern w:val="0"/>
-          <w14:ligatures w14:val="none"/>
-        </w:rPr>
-        <w:t xml:space="preserve"> what reservations to use in attractions because I would like to know the attractions information and when we can be able to do those attractions.</w:t>
+        <w:t>Yes, I would use this website to book a stay at Moffat Bay Lodge. The reservation process was simple and the website was easy to navigate. The design also made the site feel welcoming and professional.</w:t>
+      </w:r>
+      <w:r>
+        <w:rPr>
+          <w:rFonts w:ascii="Times New Roman" w:eastAsia="Times New Roman" w:hAnsi="Times New Roman" w:cs="Times New Roman"/>
+          <w:kern w:val="0"/>
+          <w14:ligatures w14:val="none"/>
+        </w:rPr>
+        <w:t xml:space="preserve"> The only thing is is that I would have difficulty on what reservations to use in attractions because I would like to know the attractions information and when we can be able to do those attractions.</w:t>
       </w:r>
     </w:p>
     <w:p>
@@ -3381,6 +3191,7 @@
   <w:style w:type="character" w:default="1" w:styleId="DefaultParagraphFont">
     <w:name w:val="Default Paragraph Font"/>
     <w:uiPriority w:val="1"/>
+    <w:semiHidden/>
     <w:unhideWhenUsed/>
   </w:style>
   <w:style w:type="table" w:default="1" w:styleId="TableNormal">

</xml_diff>